<commit_message>
chore: remove stale memory/ and docs/superpowers/ execution artifacts
</commit_message>
<xml_diff>
--- a/output_AO/Blocuri Racari/Raport_Oferta_1.docx
+++ b/output_AO/Blocuri Racari/Raport_Oferta_1.docx
@@ -13,12 +13,12 @@
     </w:p>
     <w:p>
       <w:r>
-        <w:t xml:space="preserve">Client: </w:t>
+        <w:t>Client: Blocuri Racari</w:t>
       </w:r>
     </w:p>
     <w:p>
       <w:r>
-        <w:t>Data: 2026-05-21</w:t>
+        <w:t>Data: 2026-05-22</w:t>
       </w:r>
     </w:p>
     <w:p>
@@ -26,7 +26,7 @@
         <w:pStyle w:val="Heading1"/>
       </w:pPr>
       <w:r>
-        <w:t>OFERTA 1 — Deviz "001" - Formular F3 Formular generat cu programul @Devize (www.eDevize.ro) Pagina 5 din 5 436</w:t>
+        <w:t>OFERTA 1 — Oferta 1</w:t>
       </w:r>
     </w:p>
     <w:p>
@@ -34,7 +34,7 @@
         <w:rPr>
           <w:b/>
         </w:rPr>
-        <w:t>Articole referință: 530  │  Articole ofertă: 334  │  Matched: 0  │  Neconformități: 0</w:t>
+        <w:t>Articole referință: 530  │  Articole ofertă: 361  │  Matched: 0  │  Neconformități: 0</w:t>
       </w:r>
     </w:p>
     <w:tbl>
@@ -205,7 +205,7 @@
                 <w:b/>
                 <w:sz w:val="18"/>
               </w:rPr>
-              <w:t>Deviz "001" - Formular F3 Formular generat cu programul @Devize (www.eDevize.ro) Pagina 5 din 5 436</w:t>
+              <w:t>Oferta 1</w:t>
             </w:r>
           </w:p>
         </w:tc>
@@ -30698,7 +30698,6 @@
                 <w:b w:val="0"/>
                 <w:sz w:val="16"/>
               </w:rPr>
-              <w:t>CF08A03</w:t>
             </w:r>
           </w:p>
         </w:tc>
@@ -30712,7 +30711,6 @@
                 <w:b w:val="0"/>
                 <w:sz w:val="16"/>
               </w:rPr>
-              <w:t>sistem exterior termoizolant de fatada cu - pol...</w:t>
             </w:r>
           </w:p>
         </w:tc>
@@ -30726,7 +30724,6 @@
                 <w:b w:val="0"/>
                 <w:sz w:val="16"/>
               </w:rPr>
-              <w:t>mp</w:t>
             </w:r>
           </w:p>
         </w:tc>
@@ -30740,7 +30737,6 @@
                 <w:b w:val="0"/>
                 <w:sz w:val="16"/>
               </w:rPr>
-              <w:t>13.0</w:t>
             </w:r>
           </w:p>
         </w:tc>
@@ -30855,7 +30851,6 @@
                 <w:b w:val="0"/>
                 <w:sz w:val="16"/>
               </w:rPr>
-              <w:t>CF08A03</w:t>
             </w:r>
           </w:p>
         </w:tc>
@@ -30869,7 +30864,6 @@
                 <w:b w:val="0"/>
                 <w:sz w:val="16"/>
               </w:rPr>
-              <w:t>sistem exterior termoizolant de fatada cu - pol...</w:t>
             </w:r>
           </w:p>
         </w:tc>
@@ -30883,7 +30877,6 @@
                 <w:b w:val="0"/>
                 <w:sz w:val="16"/>
               </w:rPr>
-              <w:t>mp</w:t>
             </w:r>
           </w:p>
         </w:tc>
@@ -30897,7 +30890,6 @@
                 <w:b w:val="0"/>
                 <w:sz w:val="16"/>
               </w:rPr>
-              <w:t>13.0</w:t>
             </w:r>
           </w:p>
         </w:tc>
@@ -31165,7 +31157,6 @@
                 <w:b w:val="0"/>
                 <w:sz w:val="16"/>
               </w:rPr>
-              <w:t>IZF71C</w:t>
             </w:r>
           </w:p>
         </w:tc>
@@ -31179,7 +31170,6 @@
                 <w:b w:val="0"/>
                 <w:sz w:val="16"/>
               </w:rPr>
-              <w:t>sistem termoizolant, cu vata minerala fixata pe...</w:t>
             </w:r>
           </w:p>
         </w:tc>
@@ -31193,7 +31183,6 @@
                 <w:b w:val="0"/>
                 <w:sz w:val="16"/>
               </w:rPr>
-              <w:t>mp</w:t>
             </w:r>
           </w:p>
         </w:tc>
@@ -31207,7 +31196,6 @@
                 <w:b w:val="0"/>
                 <w:sz w:val="16"/>
               </w:rPr>
-              <w:t>130.0</w:t>
             </w:r>
           </w:p>
         </w:tc>
@@ -31322,7 +31310,6 @@
                 <w:b w:val="0"/>
                 <w:sz w:val="16"/>
               </w:rPr>
-              <w:t>IZF71C</w:t>
             </w:r>
           </w:p>
         </w:tc>
@@ -31336,7 +31323,6 @@
                 <w:b w:val="0"/>
                 <w:sz w:val="16"/>
               </w:rPr>
-              <w:t>sistem termoizolant, cu vata minerala fixata pe...</w:t>
             </w:r>
           </w:p>
         </w:tc>
@@ -31350,7 +31336,6 @@
                 <w:b w:val="0"/>
                 <w:sz w:val="16"/>
               </w:rPr>
-              <w:t>mp</w:t>
             </w:r>
           </w:p>
         </w:tc>
@@ -31364,7 +31349,6 @@
                 <w:b w:val="0"/>
                 <w:sz w:val="16"/>
               </w:rPr>
-              <w:t>130.0</w:t>
             </w:r>
           </w:p>
         </w:tc>
@@ -31632,7 +31616,6 @@
                 <w:b w:val="0"/>
                 <w:sz w:val="16"/>
               </w:rPr>
-              <w:t>CL25A1</w:t>
             </w:r>
           </w:p>
         </w:tc>
@@ -31646,7 +31629,6 @@
                 <w:b w:val="0"/>
                 <w:sz w:val="16"/>
               </w:rPr>
-              <w:t>protectia muchiilor la ziduri, stalpi, trepte, ...</w:t>
             </w:r>
           </w:p>
         </w:tc>
@@ -31660,7 +31642,6 @@
                 <w:b w:val="0"/>
                 <w:sz w:val="16"/>
               </w:rPr>
-              <w:t>m</w:t>
             </w:r>
           </w:p>
         </w:tc>
@@ -31674,7 +31655,6 @@
                 <w:b w:val="0"/>
                 <w:sz w:val="16"/>
               </w:rPr>
-              <w:t>24.0</w:t>
             </w:r>
           </w:p>
         </w:tc>
@@ -31789,7 +31769,6 @@
                 <w:b w:val="0"/>
                 <w:sz w:val="16"/>
               </w:rPr>
-              <w:t>CL25A1</w:t>
             </w:r>
           </w:p>
         </w:tc>
@@ -31803,7 +31782,6 @@
                 <w:b w:val="0"/>
                 <w:sz w:val="16"/>
               </w:rPr>
-              <w:t>protectia muchiilor la ziduri, stalpi, trepte, ...</w:t>
             </w:r>
           </w:p>
         </w:tc>
@@ -31817,7 +31795,6 @@
                 <w:b w:val="0"/>
                 <w:sz w:val="16"/>
               </w:rPr>
-              <w:t>m</w:t>
             </w:r>
           </w:p>
         </w:tc>
@@ -31831,7 +31808,6 @@
                 <w:b w:val="0"/>
                 <w:sz w:val="16"/>
               </w:rPr>
-              <w:t>24.0</w:t>
             </w:r>
           </w:p>
         </w:tc>
@@ -32111,6 +32087,103 @@
               <w:rPr>
                 <w:b w:val="0"/>
                 <w:sz w:val="16"/>
+              </w:rPr>
+            </w:r>
+          </w:p>
+        </w:tc>
+        <w:tc>
+          <w:tcPr>
+            <w:tcW w:type="dxa" w:w="1984"/>
+          </w:tcPr>
+          <w:p>
+            <w:r>
+              <w:rPr>
+                <w:b w:val="0"/>
+                <w:sz w:val="16"/>
+              </w:rPr>
+            </w:r>
+          </w:p>
+        </w:tc>
+        <w:tc>
+          <w:tcPr>
+            <w:tcW w:type="dxa" w:w="454"/>
+          </w:tcPr>
+          <w:p>
+            <w:r>
+              <w:rPr>
+                <w:b w:val="0"/>
+                <w:sz w:val="16"/>
+              </w:rPr>
+            </w:r>
+          </w:p>
+        </w:tc>
+        <w:tc>
+          <w:tcPr>
+            <w:tcW w:type="dxa" w:w="680"/>
+          </w:tcPr>
+          <w:p>
+            <w:r>
+              <w:rPr>
+                <w:b w:val="0"/>
+                <w:sz w:val="16"/>
+              </w:rPr>
+            </w:r>
+          </w:p>
+        </w:tc>
+        <w:tc>
+          <w:tcPr>
+            <w:tcW w:type="dxa" w:w="3572"/>
+          </w:tcPr>
+          <w:p>
+            <w:r>
+              <w:rPr>
+                <w:b w:val="0"/>
+                <w:color w:val="CC0000"/>
+                <w:sz w:val="16"/>
+              </w:rPr>
+              <w:t>DEVIZ_MISMATCH</w:t>
+            </w:r>
+          </w:p>
+        </w:tc>
+      </w:tr>
+      <w:tr>
+        <w:tc>
+          <w:tcPr>
+            <w:tcW w:type="dxa" w:w="397"/>
+          </w:tcPr>
+          <w:p>
+            <w:r>
+              <w:rPr>
+                <w:b w:val="0"/>
+                <w:sz w:val="16"/>
+              </w:rPr>
+              <w:t>4</w:t>
+            </w:r>
+          </w:p>
+        </w:tc>
+        <w:tc>
+          <w:tcPr>
+            <w:tcW w:type="dxa" w:w="1701"/>
+          </w:tcPr>
+          <w:p>
+            <w:r>
+              <w:rPr>
+                <w:b w:val="0"/>
+                <w:sz w:val="16"/>
+              </w:rPr>
+              <w:t>BLC6 - BLC6 ORGANIZARE SANTIER</w:t>
+            </w:r>
+          </w:p>
+        </w:tc>
+        <w:tc>
+          <w:tcPr>
+            <w:tcW w:type="dxa" w:w="850"/>
+          </w:tcPr>
+          <w:p>
+            <w:r>
+              <w:rPr>
+                <w:b w:val="0"/>
+                <w:sz w:val="16"/>
                 <w:u w:val="single"/>
               </w:rPr>
               <w:t>CL25A1</w:t>
@@ -32173,6 +32246,58 @@
         </w:tc>
         <w:tc>
           <w:tcPr>
+            <w:tcW w:type="dxa" w:w="850"/>
+          </w:tcPr>
+          <w:p>
+            <w:r>
+              <w:rPr>
+                <w:b w:val="0"/>
+                <w:sz w:val="16"/>
+              </w:rPr>
+            </w:r>
+          </w:p>
+        </w:tc>
+        <w:tc>
+          <w:tcPr>
+            <w:tcW w:type="dxa" w:w="1984"/>
+          </w:tcPr>
+          <w:p>
+            <w:r>
+              <w:rPr>
+                <w:b w:val="0"/>
+                <w:sz w:val="16"/>
+              </w:rPr>
+            </w:r>
+          </w:p>
+        </w:tc>
+        <w:tc>
+          <w:tcPr>
+            <w:tcW w:type="dxa" w:w="454"/>
+          </w:tcPr>
+          <w:p>
+            <w:r>
+              <w:rPr>
+                <w:b w:val="0"/>
+                <w:sz w:val="16"/>
+              </w:rPr>
+            </w:r>
+          </w:p>
+        </w:tc>
+        <w:tc>
+          <w:tcPr>
+            <w:tcW w:type="dxa" w:w="680"/>
+          </w:tcPr>
+          <w:p>
+            <w:r>
+              <w:rPr>
+                <w:b w:val="0"/>
+                <w:sz w:val="16"/>
+              </w:rPr>
+            </w:r>
+          </w:p>
+        </w:tc>
+        <w:tc>
+          <w:tcPr>
             <w:tcW w:type="dxa" w:w="3572"/>
           </w:tcPr>
           <w:p>
@@ -32198,7 +32323,7 @@
                 <w:b w:val="0"/>
                 <w:sz w:val="16"/>
               </w:rPr>
-              <w:t>4</w:t>
+              <w:t>5</w:t>
             </w:r>
           </w:p>
         </w:tc>
@@ -32225,21 +32350,8 @@
               <w:rPr>
                 <w:b w:val="0"/>
                 <w:sz w:val="16"/>
-                <w:u w:val="single"/>
-              </w:rPr>
-              <w:t>CL25A1</w:t>
-            </w:r>
-          </w:p>
-          <w:p>
-            <w:pPr>
-              <w:ind w:left="280"/>
-            </w:pPr>
-            <w:r>
-              <w:rPr>
-                <w:b w:val="0"/>
-                <w:sz w:val="16"/>
-              </w:rPr>
-              <w:t>$7650374</w:t>
+              </w:rPr>
+              <w:t>CO06B</w:t>
             </w:r>
           </w:p>
         </w:tc>
@@ -32253,7 +32365,7 @@
                 <w:b w:val="0"/>
                 <w:sz w:val="16"/>
               </w:rPr>
-              <w:t>coltare al cu plasa -</w:t>
+              <w:t>4# - imprejmuiri plasa sarma cu panouri gard di...</w:t>
             </w:r>
           </w:p>
         </w:tc>
@@ -32281,7 +32393,7 @@
                 <w:b w:val="0"/>
                 <w:sz w:val="16"/>
               </w:rPr>
-              <w:t>24.0</w:t>
+              <w:t>30.0</w:t>
             </w:r>
           </w:p>
         </w:tc>
@@ -32294,21 +32406,7 @@
               <w:rPr>
                 <w:b w:val="0"/>
                 <w:sz w:val="16"/>
-                <w:u w:val="single"/>
-              </w:rPr>
-              <w:t>CL25A1</w:t>
-            </w:r>
-          </w:p>
-          <w:p>
-            <w:pPr>
-              <w:ind w:left="280"/>
-            </w:pPr>
-            <w:r>
-              <w:rPr>
-                <w:b w:val="0"/>
-                <w:sz w:val="16"/>
-              </w:rPr>
-              <w:t>$7650374</w:t>
+              </w:rPr>
             </w:r>
           </w:p>
         </w:tc>
@@ -32322,7 +32420,6 @@
                 <w:b w:val="0"/>
                 <w:sz w:val="16"/>
               </w:rPr>
-              <w:t>coltare al cu plasa -</w:t>
             </w:r>
           </w:p>
         </w:tc>
@@ -32336,7 +32433,6 @@
                 <w:b w:val="0"/>
                 <w:sz w:val="16"/>
               </w:rPr>
-              <w:t>m</w:t>
             </w:r>
           </w:p>
         </w:tc>
@@ -32350,7 +32446,6 @@
                 <w:b w:val="0"/>
                 <w:sz w:val="16"/>
               </w:rPr>
-              <w:t>24.0</w:t>
             </w:r>
           </w:p>
         </w:tc>
@@ -32409,7 +32504,7 @@
                 <w:b w:val="0"/>
                 <w:sz w:val="16"/>
               </w:rPr>
-              <w:t>CO06B</w:t>
+              <w:t>CF13D01</w:t>
             </w:r>
           </w:p>
         </w:tc>
@@ -32423,7 +32518,7 @@
                 <w:b w:val="0"/>
                 <w:sz w:val="16"/>
               </w:rPr>
-              <w:t>4# - imprejmuiri plasa sarma cu panouri gard di...</w:t>
+              <w:t>aplicarea unei tencuieli decorative acrilice - ...</w:t>
             </w:r>
           </w:p>
         </w:tc>
@@ -32437,7 +32532,7 @@
                 <w:b w:val="0"/>
                 <w:sz w:val="16"/>
               </w:rPr>
-              <w:t>m</w:t>
+              <w:t>mp</w:t>
             </w:r>
           </w:p>
         </w:tc>
@@ -32451,7 +32546,7 @@
                 <w:b w:val="0"/>
                 <w:sz w:val="16"/>
               </w:rPr>
-              <w:t>30.0</w:t>
+              <w:t>143.0</w:t>
             </w:r>
           </w:p>
         </w:tc>
@@ -32618,7 +32713,6 @@
                 <w:b w:val="0"/>
                 <w:sz w:val="16"/>
               </w:rPr>
-              <w:t>CF13D01</w:t>
             </w:r>
           </w:p>
         </w:tc>
@@ -32632,7 +32726,6 @@
                 <w:b w:val="0"/>
                 <w:sz w:val="16"/>
               </w:rPr>
-              <w:t>aplicarea unei tencuieli decorative acrilice - ...</w:t>
             </w:r>
           </w:p>
         </w:tc>
@@ -32646,7 +32739,6 @@
                 <w:b w:val="0"/>
                 <w:sz w:val="16"/>
               </w:rPr>
-              <w:t>mp</w:t>
             </w:r>
           </w:p>
         </w:tc>
@@ -32660,7 +32752,6 @@
                 <w:b w:val="0"/>
                 <w:sz w:val="16"/>
               </w:rPr>
-              <w:t>143.0</w:t>
             </w:r>
           </w:p>
         </w:tc>
@@ -32691,7 +32782,7 @@
                 <w:b w:val="0"/>
                 <w:sz w:val="16"/>
               </w:rPr>
-              <w:t>5</w:t>
+              <w:t>6</w:t>
             </w:r>
           </w:p>
         </w:tc>
@@ -32719,7 +32810,7 @@
                 <w:b w:val="0"/>
                 <w:sz w:val="16"/>
               </w:rPr>
-              <w:t>CF13D01</w:t>
+              <w:t>RPCP16C</w:t>
             </w:r>
           </w:p>
         </w:tc>
@@ -32733,7 +32824,7 @@
                 <w:b w:val="0"/>
                 <w:sz w:val="16"/>
               </w:rPr>
-              <w:t>aplicarea unei tencuieli decorative acrilice - ...</w:t>
+              <w:t>panouri plasa sarma zincata: montare - panouri ...</w:t>
             </w:r>
           </w:p>
         </w:tc>
@@ -32761,7 +32852,7 @@
                 <w:b w:val="0"/>
                 <w:sz w:val="16"/>
               </w:rPr>
-              <w:t>143.0</w:t>
+              <w:t>60.0</w:t>
             </w:r>
           </w:p>
         </w:tc>
@@ -32775,7 +32866,6 @@
                 <w:b w:val="0"/>
                 <w:sz w:val="16"/>
               </w:rPr>
-              <w:t>CF13D01</w:t>
             </w:r>
           </w:p>
         </w:tc>
@@ -32789,7 +32879,6 @@
                 <w:b w:val="0"/>
                 <w:sz w:val="16"/>
               </w:rPr>
-              <w:t>aplicarea unei tencuieli decorative acrilice - ...</w:t>
             </w:r>
           </w:p>
         </w:tc>
@@ -32803,7 +32892,6 @@
                 <w:b w:val="0"/>
                 <w:sz w:val="16"/>
               </w:rPr>
-              <w:t>mp</w:t>
             </w:r>
           </w:p>
         </w:tc>
@@ -32817,7 +32905,6 @@
                 <w:b w:val="0"/>
                 <w:sz w:val="16"/>
               </w:rPr>
-              <w:t>143.0</w:t>
             </w:r>
           </w:p>
         </w:tc>
@@ -32876,7 +32963,7 @@
                 <w:b w:val="0"/>
                 <w:sz w:val="16"/>
               </w:rPr>
-              <w:t>RPCP16C</w:t>
+              <w:t>CK23A</w:t>
             </w:r>
           </w:p>
         </w:tc>
@@ -32890,7 +32977,7 @@
                 <w:b w:val="0"/>
                 <w:sz w:val="16"/>
               </w:rPr>
-              <w:t>panouri plasa sarma zincata: montare - panouri ...</w:t>
+              <w:t>ferestre din mase plastice cu unul sau mai - mu...</w:t>
             </w:r>
           </w:p>
         </w:tc>
@@ -32918,7 +33005,7 @@
                 <w:b w:val="0"/>
                 <w:sz w:val="16"/>
               </w:rPr>
-              <w:t>60.0</w:t>
+              <w:t>18.55</w:t>
             </w:r>
           </w:p>
         </w:tc>
@@ -33085,7 +33172,6 @@
                 <w:b w:val="0"/>
                 <w:sz w:val="16"/>
               </w:rPr>
-              <w:t>CK23A</w:t>
             </w:r>
           </w:p>
         </w:tc>
@@ -33099,7 +33185,6 @@
                 <w:b w:val="0"/>
                 <w:sz w:val="16"/>
               </w:rPr>
-              <w:t>ferestre din mase plastice cu unul sau mai - - ...</w:t>
             </w:r>
           </w:p>
         </w:tc>
@@ -33113,7 +33198,6 @@
                 <w:b w:val="0"/>
                 <w:sz w:val="16"/>
               </w:rPr>
-              <w:t>mp</w:t>
             </w:r>
           </w:p>
         </w:tc>
@@ -33127,164 +33211,6 @@
                 <w:b w:val="0"/>
                 <w:sz w:val="16"/>
               </w:rPr>
-              <w:t>18.55</w:t>
-            </w:r>
-          </w:p>
-        </w:tc>
-        <w:tc>
-          <w:tcPr>
-            <w:tcW w:type="dxa" w:w="3572"/>
-          </w:tcPr>
-          <w:p>
-            <w:r>
-              <w:rPr>
-                <w:b w:val="0"/>
-                <w:color w:val="CC0000"/>
-                <w:sz w:val="16"/>
-              </w:rPr>
-              <w:t>DEVIZ_MISMATCH</w:t>
-            </w:r>
-          </w:p>
-        </w:tc>
-      </w:tr>
-      <w:tr>
-        <w:tc>
-          <w:tcPr>
-            <w:tcW w:type="dxa" w:w="397"/>
-          </w:tcPr>
-          <w:p>
-            <w:r>
-              <w:rPr>
-                <w:b w:val="0"/>
-                <w:sz w:val="16"/>
-              </w:rPr>
-              <w:t>6</w:t>
-            </w:r>
-          </w:p>
-        </w:tc>
-        <w:tc>
-          <w:tcPr>
-            <w:tcW w:type="dxa" w:w="1701"/>
-          </w:tcPr>
-          <w:p>
-            <w:r>
-              <w:rPr>
-                <w:b w:val="0"/>
-                <w:sz w:val="16"/>
-              </w:rPr>
-              <w:t>BLC6 - BLC6 ORGANIZARE SANTIER</w:t>
-            </w:r>
-          </w:p>
-        </w:tc>
-        <w:tc>
-          <w:tcPr>
-            <w:tcW w:type="dxa" w:w="850"/>
-          </w:tcPr>
-          <w:p>
-            <w:r>
-              <w:rPr>
-                <w:b w:val="0"/>
-                <w:sz w:val="16"/>
-              </w:rPr>
-              <w:t>CK23A</w:t>
-            </w:r>
-          </w:p>
-        </w:tc>
-        <w:tc>
-          <w:tcPr>
-            <w:tcW w:type="dxa" w:w="1984"/>
-          </w:tcPr>
-          <w:p>
-            <w:r>
-              <w:rPr>
-                <w:b w:val="0"/>
-                <w:sz w:val="16"/>
-              </w:rPr>
-              <w:t>ferestre din mase plastice cu unul sau mai - mu...</w:t>
-            </w:r>
-          </w:p>
-        </w:tc>
-        <w:tc>
-          <w:tcPr>
-            <w:tcW w:type="dxa" w:w="454"/>
-          </w:tcPr>
-          <w:p>
-            <w:r>
-              <w:rPr>
-                <w:b w:val="0"/>
-                <w:sz w:val="16"/>
-              </w:rPr>
-              <w:t>mp</w:t>
-            </w:r>
-          </w:p>
-        </w:tc>
-        <w:tc>
-          <w:tcPr>
-            <w:tcW w:type="dxa" w:w="680"/>
-          </w:tcPr>
-          <w:p>
-            <w:r>
-              <w:rPr>
-                <w:b w:val="0"/>
-                <w:sz w:val="16"/>
-              </w:rPr>
-              <w:t>18.55</w:t>
-            </w:r>
-          </w:p>
-        </w:tc>
-        <w:tc>
-          <w:tcPr>
-            <w:tcW w:type="dxa" w:w="850"/>
-          </w:tcPr>
-          <w:p>
-            <w:r>
-              <w:rPr>
-                <w:b w:val="0"/>
-                <w:sz w:val="16"/>
-              </w:rPr>
-              <w:t>CK23A</w:t>
-            </w:r>
-          </w:p>
-        </w:tc>
-        <w:tc>
-          <w:tcPr>
-            <w:tcW w:type="dxa" w:w="1984"/>
-          </w:tcPr>
-          <w:p>
-            <w:r>
-              <w:rPr>
-                <w:b w:val="0"/>
-                <w:sz w:val="16"/>
-              </w:rPr>
-              <w:t>ferestre din mase plastice cu unul sau mai - - ...</w:t>
-            </w:r>
-          </w:p>
-        </w:tc>
-        <w:tc>
-          <w:tcPr>
-            <w:tcW w:type="dxa" w:w="454"/>
-          </w:tcPr>
-          <w:p>
-            <w:r>
-              <w:rPr>
-                <w:b w:val="0"/>
-                <w:sz w:val="16"/>
-              </w:rPr>
-              <w:t>mp</w:t>
-            </w:r>
-          </w:p>
-        </w:tc>
-        <w:tc>
-          <w:tcPr>
-            <w:tcW w:type="dxa" w:w="680"/>
-          </w:tcPr>
-          <w:p>
-            <w:r>
-              <w:rPr>
-                <w:b w:val="0"/>
-                <w:sz w:val="16"/>
-              </w:rPr>
-              <w:t>18.55</w:t>
             </w:r>
           </w:p>
         </w:tc>

</xml_diff>